<commit_message>
Integrated Frontend and Backend with UI Optimisation
</commit_message>
<xml_diff>
--- a/Docs/SGP_PermissionLetter.docx
+++ b/Docs/SGP_PermissionLetter.docx
@@ -4,7 +4,7 @@
   <w:body>
     <w:p>
       <w:pPr>
-        <w:jc w:val="center"/>
+        <w:jc w:val="both"/>
         <w:rPr>
           <w:b/>
           <w:bCs/>
@@ -15,18 +15,165 @@
           <w:b/>
           <w:bCs/>
         </w:rPr>
-        <w:t>TO WHOMSOEVER IT MAY CONCERN</w:t>
+        <w:t>To,</w:t>
+      </w:r>
+      <w:r>
+        <w:rPr>
+          <w:b/>
+          <w:bCs/>
+        </w:rPr>
+        <w:tab/>
+      </w:r>
+      <w:r>
+        <w:rPr>
+          <w:b/>
+          <w:bCs/>
+        </w:rPr>
+        <w:tab/>
+      </w:r>
+      <w:r>
+        <w:rPr>
+          <w:b/>
+          <w:bCs/>
+        </w:rPr>
+        <w:tab/>
+      </w:r>
+      <w:r>
+        <w:rPr>
+          <w:b/>
+          <w:bCs/>
+        </w:rPr>
+        <w:tab/>
+      </w:r>
+      <w:r>
+        <w:rPr>
+          <w:b/>
+          <w:bCs/>
+        </w:rPr>
+        <w:tab/>
+      </w:r>
+      <w:r>
+        <w:rPr>
+          <w:b/>
+          <w:bCs/>
+        </w:rPr>
+        <w:tab/>
+      </w:r>
+      <w:r>
+        <w:rPr>
+          <w:b/>
+          <w:bCs/>
+        </w:rPr>
+        <w:tab/>
+      </w:r>
+      <w:r>
+        <w:rPr>
+          <w:b/>
+          <w:bCs/>
+        </w:rPr>
+        <w:tab/>
+      </w:r>
+      <w:r>
+        <w:rPr>
+          <w:b/>
+          <w:bCs/>
+        </w:rPr>
+        <w:tab/>
+        <w:t xml:space="preserve">Date: </w:t>
+      </w:r>
+      <w:r>
+        <w:rPr>
+          <w:b/>
+          <w:bCs/>
+        </w:rPr>
+        <w:t>9</w:t>
+      </w:r>
+      <w:r>
+        <w:rPr>
+          <w:b/>
+          <w:bCs/>
+          <w:vertAlign w:val="superscript"/>
+        </w:rPr>
+        <w:t>th</w:t>
+      </w:r>
+      <w:r>
+        <w:rPr>
+          <w:b/>
+          <w:bCs/>
+        </w:rPr>
+        <w:t xml:space="preserve"> Jan 2026</w:t>
+      </w:r>
+    </w:p>
+    <w:p>
+      <w:pPr>
+        <w:jc w:val="both"/>
+        <w:rPr>
+          <w:b/>
+          <w:bCs/>
+        </w:rPr>
+      </w:pPr>
+      <w:r>
+        <w:rPr>
+          <w:b/>
+          <w:bCs/>
+        </w:rPr>
+        <w:t>Head of the Department</w:t>
+      </w:r>
+    </w:p>
+    <w:p>
+      <w:pPr>
+        <w:jc w:val="both"/>
+        <w:rPr>
+          <w:b/>
+          <w:bCs/>
+        </w:rPr>
+      </w:pPr>
+      <w:r>
+        <w:rPr>
+          <w:b/>
+          <w:bCs/>
+        </w:rPr>
+        <w:t xml:space="preserve">CSPIT </w:t>
+      </w:r>
+      <w:r>
+        <w:rPr>
+          <w:b/>
+          <w:bCs/>
+        </w:rPr>
+        <w:t xml:space="preserve">- Computer Engineering </w:t>
+      </w:r>
+    </w:p>
+    <w:p>
+      <w:pPr>
+        <w:jc w:val="both"/>
+        <w:rPr>
+          <w:b/>
+          <w:bCs/>
+        </w:rPr>
+      </w:pPr>
+      <w:r>
+        <w:rPr>
+          <w:b/>
+          <w:bCs/>
+        </w:rPr>
+        <w:t>Charotar University of Science and Technology</w:t>
       </w:r>
     </w:p>
     <w:p/>
     <w:p>
       <w:r>
-        <w:t>Respected Madam/Sir,</w:t>
+        <w:t>Respected Madam,</w:t>
       </w:r>
     </w:p>
     <w:p>
       <w:r>
-        <w:t xml:space="preserve">We, the undersigned students of the Computer Engineering Department from Semester IV, humbly request your kind permission to allow our group, comprising six students, to participate in the </w:t>
+        <w:t xml:space="preserve">We, the undersigned students of the Computer Engineering Department from Semester IV, humbly request your kind permission to allow our group, comprising </w:t>
+      </w:r>
+      <w:r>
+        <w:t>five</w:t>
+      </w:r>
+      <w:r>
+        <w:t xml:space="preserve"> students, to participate in the </w:t>
       </w:r>
       <w:r>
         <w:rPr>
@@ -58,23 +205,7 @@
           <w:b/>
           <w:bCs/>
         </w:rPr>
-        <w:t xml:space="preserve">Prof. </w:t>
-      </w:r>
-      <w:proofErr w:type="spellStart"/>
-      <w:r>
-        <w:rPr>
-          <w:b/>
-          <w:bCs/>
-        </w:rPr>
-        <w:t>Mrugendra</w:t>
-      </w:r>
-      <w:proofErr w:type="spellEnd"/>
-      <w:r>
-        <w:rPr>
-          <w:b/>
-          <w:bCs/>
-        </w:rPr>
-        <w:t xml:space="preserve"> Rahevar</w:t>
+        <w:t>Prof. Mrugendra Rahevar</w:t>
       </w:r>
       <w:r>
         <w:t xml:space="preserve">. The project has demonstrated significant scope and potential, and we are keen to continue its development further by extending it as a </w:t>
@@ -92,12 +223,24 @@
     </w:p>
     <w:p>
       <w:r>
-        <w:t>We, therefore, respectfully request you to grant approval for our group of six students to undertake the Software Group Project collectively.</w:t>
+        <w:t>We, therefore, respectfully request you to grant approval for our group o</w:t>
+      </w:r>
+      <w:r>
+        <w:t>f five</w:t>
+      </w:r>
+      <w:r>
+        <w:t xml:space="preserve"> students to undertake the Software Group Project collectively.</w:t>
       </w:r>
     </w:p>
     <w:p>
       <w:r>
-        <w:t>The details of the group members are as follows:</w:t>
+        <w:t>The details of the group members</w:t>
+      </w:r>
+      <w:r>
+        <w:t xml:space="preserve"> along with their respective roles</w:t>
+      </w:r>
+      <w:r>
+        <w:t xml:space="preserve"> are as follows:</w:t>
       </w:r>
     </w:p>
     <w:tbl>
@@ -113,9 +256,9 @@
         <w:tblLook w:val="04A0" w:firstRow="1" w:lastRow="0" w:firstColumn="1" w:lastColumn="0" w:noHBand="0" w:noVBand="1"/>
       </w:tblPr>
       <w:tblGrid>
-        <w:gridCol w:w="2041"/>
-        <w:gridCol w:w="1677"/>
-        <w:gridCol w:w="5714"/>
+        <w:gridCol w:w="1535"/>
+        <w:gridCol w:w="1260"/>
+        <w:gridCol w:w="6637"/>
       </w:tblGrid>
       <w:tr>
         <w:trPr>
@@ -187,6 +330,13 @@
               </w:rPr>
               <w:t>Designation</w:t>
             </w:r>
+            <w:r>
+              <w:rPr>
+                <w:b/>
+                <w:bCs/>
+              </w:rPr>
+              <w:t xml:space="preserve">                                                                            Signature </w:t>
+            </w:r>
           </w:p>
         </w:tc>
       </w:tr>
@@ -229,6 +379,9 @@
             <w:r>
               <w:t>Backend Developer &amp; Security Testing</w:t>
             </w:r>
+            <w:r>
+              <w:t xml:space="preserve">        </w:t>
+            </w:r>
           </w:p>
         </w:tc>
       </w:tr>
@@ -269,7 +422,10 @@
           </w:tcPr>
           <w:p>
             <w:r>
-              <w:t>Backend Developer</w:t>
+              <w:t xml:space="preserve">Full Stack </w:t>
+            </w:r>
+            <w:r>
+              <w:t>Developer</w:t>
             </w:r>
           </w:p>
         </w:tc>
@@ -403,75 +559,6 @@
           </w:p>
         </w:tc>
       </w:tr>
-      <w:tr>
-        <w:trPr>
-          <w:trHeight w:val="445"/>
-          <w:tblCellSpacing w:w="15" w:type="dxa"/>
-        </w:trPr>
-        <w:tc>
-          <w:tcPr>
-            <w:tcW w:w="0" w:type="auto"/>
-            <w:vAlign w:val="center"/>
-            <w:hideMark/>
-          </w:tcPr>
-          <w:p>
-            <w:r>
-              <w:t>Yashvi Gor</w:t>
-            </w:r>
-          </w:p>
-        </w:tc>
-        <w:tc>
-          <w:tcPr>
-            <w:tcW w:w="0" w:type="auto"/>
-            <w:vAlign w:val="center"/>
-            <w:hideMark/>
-          </w:tcPr>
-          <w:p>
-            <w:r>
-              <w:t>24CE037</w:t>
-            </w:r>
-          </w:p>
-        </w:tc>
-        <w:tc>
-          <w:tcPr>
-            <w:tcW w:w="0" w:type="auto"/>
-            <w:vAlign w:val="center"/>
-            <w:hideMark/>
-          </w:tcPr>
-          <w:p>
-            <w:r>
-              <w:t>Frontend Developer</w:t>
-            </w:r>
-          </w:p>
-        </w:tc>
-      </w:tr>
-      <w:tr>
-        <w:trPr>
-          <w:trHeight w:val="455"/>
-          <w:tblCellSpacing w:w="15" w:type="dxa"/>
-        </w:trPr>
-        <w:tc>
-          <w:tcPr>
-            <w:tcW w:w="0" w:type="auto"/>
-            <w:vAlign w:val="center"/>
-          </w:tcPr>
-          <w:p/>
-        </w:tc>
-        <w:tc>
-          <w:tcPr>
-            <w:tcW w:w="0" w:type="auto"/>
-            <w:vAlign w:val="center"/>
-          </w:tcPr>
-          <w:p/>
-        </w:tc>
-        <w:tc>
-          <w:tcPr>
-            <w:tcW w:w="0" w:type="auto"/>
-            <w:vAlign w:val="center"/>
-          </w:tcPr>
-          <w:p/>
-        </w:tc>
-      </w:tr>
     </w:tbl>
     <w:p>
       <w:r>
@@ -490,43 +577,32 @@
         <w:spacing w:after="0"/>
       </w:pPr>
       <w:r>
-        <w:tab/>
-      </w:r>
-      <w:r>
-        <w:tab/>
-      </w:r>
-      <w:r>
-        <w:tab/>
-      </w:r>
-      <w:r>
-        <w:tab/>
-      </w:r>
-      <w:r>
-        <w:tab/>
-      </w:r>
-      <w:r>
-        <w:tab/>
-      </w:r>
-      <w:r>
-        <w:tab/>
-      </w:r>
-      <w:r>
-        <w:tab/>
-        <w:t xml:space="preserve">Prof. </w:t>
-      </w:r>
-      <w:proofErr w:type="spellStart"/>
-      <w:r>
-        <w:t>Mru</w:t>
-      </w:r>
-      <w:r>
-        <w:t>gendra</w:t>
-      </w:r>
-      <w:proofErr w:type="spellEnd"/>
-      <w:r>
-        <w:t xml:space="preserve"> Rahevar</w:t>
-      </w:r>
-      <w:r>
-        <w:tab/>
+        <w:t>Prof. Mru</w:t>
+      </w:r>
+      <w:r>
+        <w:t>gendra Rahevar</w:t>
+      </w:r>
+      <w:r>
+        <w:tab/>
+      </w:r>
+      <w:r>
+        <w:tab/>
+      </w:r>
+      <w:r>
+        <w:tab/>
+      </w:r>
+      <w:r>
+        <w:tab/>
+      </w:r>
+      <w:r>
+        <w:tab/>
+      </w:r>
+      <w:r>
+        <w:tab/>
+      </w:r>
+      <w:r>
+        <w:tab/>
+        <w:t>Nikita Bhatt</w:t>
       </w:r>
     </w:p>
     <w:p>
@@ -534,34 +610,32 @@
         <w:spacing w:after="0"/>
       </w:pPr>
       <w:r>
-        <w:tab/>
-      </w:r>
-      <w:r>
-        <w:tab/>
-      </w:r>
-      <w:r>
-        <w:tab/>
-      </w:r>
-      <w:r>
-        <w:tab/>
-      </w:r>
-      <w:r>
-        <w:tab/>
-      </w:r>
-      <w:r>
-        <w:tab/>
-      </w:r>
-      <w:r>
-        <w:tab/>
-      </w:r>
-      <w:r>
-        <w:tab/>
-      </w:r>
-      <w:r>
         <w:t xml:space="preserve">        </w:t>
       </w:r>
       <w:r>
         <w:t>Faculty Mentor</w:t>
+      </w:r>
+      <w:r>
+        <w:tab/>
+      </w:r>
+      <w:r>
+        <w:tab/>
+      </w:r>
+      <w:r>
+        <w:tab/>
+      </w:r>
+      <w:r>
+        <w:tab/>
+      </w:r>
+      <w:r>
+        <w:tab/>
+      </w:r>
+      <w:r>
+        <w:tab/>
+      </w:r>
+      <w:r>
+        <w:tab/>
+        <w:t>Head of the Department</w:t>
       </w:r>
     </w:p>
     <w:sectPr>
@@ -1177,6 +1251,7 @@
   <w:style w:type="character" w:default="1" w:styleId="DefaultParagraphFont">
     <w:name w:val="Default Paragraph Font"/>
     <w:uiPriority w:val="1"/>
+    <w:semiHidden/>
     <w:unhideWhenUsed/>
   </w:style>
   <w:style w:type="table" w:default="1" w:styleId="TableNormal">

</xml_diff>